<commit_message>
feat: add CoverPemberkasan component, EDM section form page, and SPTJM non-PNS monthly template
</commit_message>
<xml_diff>
--- a/public/templates/form-sptjm-non-pns-bulanan.docx
+++ b/public/templates/form-sptjm-non-pns-bulanan.docx
@@ -381,25 +381,7 @@
           <w:sz w:val="24"/>
           <w:szCs w:val="24"/>
         </w:rPr>
-        <w:t>{</w:t>
-      </w:r>
-      <w:proofErr w:type="spellStart"/>
-      <w:r>
-        <w:rPr>
-          <w:rFonts w:ascii="Arial" w:eastAsia="Arial" w:hAnsi="Arial" w:cs="Arial"/>
-          <w:sz w:val="24"/>
-          <w:szCs w:val="24"/>
-        </w:rPr>
-        <w:t>no_surat</w:t>
-      </w:r>
-      <w:proofErr w:type="spellEnd"/>
-      <w:r>
-        <w:rPr>
-          <w:rFonts w:ascii="Arial" w:eastAsia="Arial" w:hAnsi="Arial" w:cs="Arial"/>
-          <w:sz w:val="24"/>
-          <w:szCs w:val="24"/>
-        </w:rPr>
-        <w:t>}</w:t>
+        <w:t>{no_surat}</w:t>
       </w:r>
     </w:p>
     <w:p>
@@ -471,18 +453,8 @@
           <w:szCs w:val="24"/>
         </w:rPr>
         <w:tab/>
-        <w:t xml:space="preserve">ABDUL HALIM, </w:t>
-      </w:r>
-      <w:proofErr w:type="spellStart"/>
-      <w:r>
-        <w:rPr>
-          <w:rFonts w:ascii="Arial" w:eastAsia="Arial" w:hAnsi="Arial" w:cs="Arial"/>
-          <w:sz w:val="24"/>
-          <w:szCs w:val="24"/>
-        </w:rPr>
-        <w:t>S.Pd.I</w:t>
-      </w:r>
-      <w:proofErr w:type="spellEnd"/>
+        <w:t>ABDUL HALIM, S.Pd.I</w:t>
+      </w:r>
     </w:p>
     <w:p>
       <w:pPr>
@@ -666,25 +638,14 @@
         </w:rPr>
         <w:t xml:space="preserve"> pada Madrasah </w:t>
       </w:r>
-      <w:proofErr w:type="spellStart"/>
-      <w:r>
-        <w:rPr>
-          <w:rFonts w:ascii="Arial" w:eastAsia="Arial" w:hAnsi="Arial" w:cs="Arial"/>
-          <w:color w:val="000000"/>
-          <w:sz w:val="24"/>
-          <w:szCs w:val="24"/>
-        </w:rPr>
-        <w:t>Ibtida’iyah</w:t>
-      </w:r>
-      <w:proofErr w:type="spellEnd"/>
-      <w:r>
-        <w:rPr>
-          <w:rFonts w:ascii="Arial" w:eastAsia="Arial" w:hAnsi="Arial" w:cs="Arial"/>
-          <w:color w:val="000000"/>
-          <w:sz w:val="24"/>
-          <w:szCs w:val="24"/>
-        </w:rPr>
-        <w:t xml:space="preserve"> NW Penyenggir</w:t>
+      <w:r>
+        <w:rPr>
+          <w:rFonts w:ascii="Arial" w:eastAsia="Arial" w:hAnsi="Arial" w:cs="Arial"/>
+          <w:color w:val="000000"/>
+          <w:sz w:val="24"/>
+          <w:szCs w:val="24"/>
+        </w:rPr>
+        <w:t>Ibtida’iyah NW Penyenggir</w:t>
       </w:r>
       <w:r>
         <w:rPr>
@@ -895,20 +856,8 @@
           <w:szCs w:val="24"/>
           <w:lang w:val="en-US"/>
         </w:rPr>
-        <w:t xml:space="preserve">Guru </w:t>
-      </w:r>
-      <w:proofErr w:type="spellStart"/>
-      <w:r>
-        <w:rPr>
-          <w:rFonts w:ascii="Arial" w:eastAsia="Arial" w:hAnsi="Arial" w:cs="Arial"/>
-          <w:color w:val="000000"/>
-          <w:sz w:val="24"/>
-          <w:szCs w:val="24"/>
-          <w:lang w:val="en-US"/>
-        </w:rPr>
-        <w:t>Bukan</w:t>
-      </w:r>
-      <w:proofErr w:type="spellEnd"/>
+        <w:t>Guru Bukan</w:t>
+      </w:r>
       <w:r>
         <w:rPr>
           <w:rFonts w:ascii="Arial" w:eastAsia="Arial" w:hAnsi="Arial" w:cs="Arial"/>
@@ -934,27 +883,7 @@
           <w:sz w:val="24"/>
           <w:szCs w:val="24"/>
         </w:rPr>
-        <w:t xml:space="preserve"> </w:t>
-      </w:r>
-      <w:proofErr w:type="spellStart"/>
-      <w:r>
-        <w:rPr>
-          <w:rFonts w:ascii="Arial" w:eastAsia="Arial" w:hAnsi="Arial" w:cs="Arial"/>
-          <w:color w:val="000000"/>
-          <w:sz w:val="24"/>
-          <w:szCs w:val="24"/>
-        </w:rPr>
-        <w:t>Inpassing</w:t>
-      </w:r>
-      <w:proofErr w:type="spellEnd"/>
-      <w:r>
-        <w:rPr>
-          <w:rFonts w:ascii="Arial" w:eastAsia="Arial" w:hAnsi="Arial" w:cs="Arial"/>
-          <w:color w:val="000000"/>
-          <w:sz w:val="24"/>
-          <w:szCs w:val="24"/>
-        </w:rPr>
-        <w:t xml:space="preserve"> Layak Bayar </w:t>
+        <w:t xml:space="preserve"> Inpassing Layak Bayar </w:t>
       </w:r>
       <w:r>
         <w:rPr>
@@ -1000,19 +929,8 @@
           <w:sz w:val="24"/>
           <w:szCs w:val="24"/>
         </w:rPr>
-        <w:t xml:space="preserve"> </w:t>
-      </w:r>
-      <w:proofErr w:type="gramStart"/>
-      <w:r>
-        <w:rPr>
-          <w:rFonts w:ascii="Arial" w:eastAsia="Arial" w:hAnsi="Arial" w:cs="Arial"/>
-          <w:color w:val="000000"/>
-          <w:sz w:val="24"/>
-          <w:szCs w:val="24"/>
-        </w:rPr>
-        <w:t>orang</w:t>
-      </w:r>
-      <w:proofErr w:type="gramEnd"/>
+        <w:t xml:space="preserve"> orang</w:t>
+      </w:r>
     </w:p>
     <w:p>
       <w:pPr>
@@ -1050,20 +968,8 @@
           <w:szCs w:val="24"/>
           <w:lang w:val="en-US"/>
         </w:rPr>
-        <w:t xml:space="preserve">Guru </w:t>
-      </w:r>
-      <w:proofErr w:type="spellStart"/>
-      <w:r>
-        <w:rPr>
-          <w:rFonts w:ascii="Arial" w:eastAsia="Arial" w:hAnsi="Arial" w:cs="Arial"/>
-          <w:color w:val="000000"/>
-          <w:sz w:val="24"/>
-          <w:szCs w:val="24"/>
-          <w:lang w:val="en-US"/>
-        </w:rPr>
-        <w:t>Bukan</w:t>
-      </w:r>
-      <w:proofErr w:type="spellEnd"/>
+        <w:t>Guru Bukan</w:t>
+      </w:r>
       <w:r>
         <w:rPr>
           <w:rFonts w:ascii="Arial" w:eastAsia="Arial" w:hAnsi="Arial" w:cs="Arial"/>
@@ -1089,27 +995,7 @@
           <w:sz w:val="24"/>
           <w:szCs w:val="24"/>
         </w:rPr>
-        <w:t xml:space="preserve"> Non </w:t>
-      </w:r>
-      <w:proofErr w:type="spellStart"/>
-      <w:r>
-        <w:rPr>
-          <w:rFonts w:ascii="Arial" w:eastAsia="Arial" w:hAnsi="Arial" w:cs="Arial"/>
-          <w:color w:val="000000"/>
-          <w:sz w:val="24"/>
-          <w:szCs w:val="24"/>
-        </w:rPr>
-        <w:t>Inpassing</w:t>
-      </w:r>
-      <w:proofErr w:type="spellEnd"/>
-      <w:r>
-        <w:rPr>
-          <w:rFonts w:ascii="Arial" w:eastAsia="Arial" w:hAnsi="Arial" w:cs="Arial"/>
-          <w:color w:val="000000"/>
-          <w:sz w:val="24"/>
-          <w:szCs w:val="24"/>
-        </w:rPr>
-        <w:t xml:space="preserve"> Layak Bayar </w:t>
+        <w:t xml:space="preserve"> Non Inpassing Layak Bayar </w:t>
       </w:r>
       <w:r>
         <w:rPr>
@@ -1137,7 +1023,7 @@
           <w:sz w:val="24"/>
           <w:szCs w:val="24"/>
         </w:rPr>
-        <w:t>1</w:t>
+        <w:t>4</w:t>
       </w:r>
       <w:r>
         <w:rPr>
@@ -1371,7 +1257,7 @@
           <w:sz w:val="24"/>
           <w:szCs w:val="24"/>
         </w:rPr>
-        <w:t>8</w:t>
+        <w:t>11</w:t>
       </w:r>
       <w:r>
         <w:rPr>
@@ -1651,25 +1537,7 @@
           <w:sz w:val="24"/>
           <w:szCs w:val="24"/>
         </w:rPr>
-        <w:t xml:space="preserve">berurutan sesuai urutan berkas </w:t>
-      </w:r>
-      <w:proofErr w:type="spellStart"/>
-      <w:r>
-        <w:rPr>
-          <w:rFonts w:ascii="Arial" w:eastAsia="Arial" w:hAnsi="Arial" w:cs="Arial"/>
-          <w:sz w:val="24"/>
-          <w:szCs w:val="24"/>
-        </w:rPr>
-        <w:t>diatas</w:t>
-      </w:r>
-      <w:proofErr w:type="spellEnd"/>
-      <w:r>
-        <w:rPr>
-          <w:rFonts w:ascii="Arial" w:eastAsia="Arial" w:hAnsi="Arial" w:cs="Arial"/>
-          <w:sz w:val="24"/>
-          <w:szCs w:val="24"/>
-        </w:rPr>
-        <w:t xml:space="preserve"> </w:t>
+        <w:t xml:space="preserve">berurutan sesuai urutan berkas diatas </w:t>
       </w:r>
       <w:r>
         <w:rPr>
@@ -1709,25 +1577,7 @@
           <w:sz w:val="24"/>
           <w:szCs w:val="24"/>
         </w:rPr>
-        <w:t xml:space="preserve"> </w:t>
-      </w:r>
-      <w:proofErr w:type="spellStart"/>
-      <w:r>
-        <w:rPr>
-          <w:rFonts w:ascii="Arial" w:eastAsia="Arial" w:hAnsi="Arial" w:cs="Arial"/>
-          <w:sz w:val="24"/>
-          <w:szCs w:val="24"/>
-        </w:rPr>
-        <w:t>Ibtida’iyah</w:t>
-      </w:r>
-      <w:proofErr w:type="spellEnd"/>
-      <w:r>
-        <w:rPr>
-          <w:rFonts w:ascii="Arial" w:eastAsia="Arial" w:hAnsi="Arial" w:cs="Arial"/>
-          <w:sz w:val="24"/>
-          <w:szCs w:val="24"/>
-        </w:rPr>
-        <w:t xml:space="preserve"> NW Penyenggir,</w:t>
+        <w:t xml:space="preserve"> Ibtida’iyah NW Penyenggir,</w:t>
       </w:r>
       <w:r>
         <w:rPr>
@@ -1871,25 +1721,7 @@
           <w:sz w:val="24"/>
           <w:szCs w:val="24"/>
         </w:rPr>
-        <w:t>{</w:t>
-      </w:r>
-      <w:proofErr w:type="spellStart"/>
-      <w:r>
-        <w:rPr>
-          <w:rFonts w:ascii="Arial" w:eastAsia="Arial" w:hAnsi="Arial" w:cs="Arial"/>
-          <w:sz w:val="24"/>
-          <w:szCs w:val="24"/>
-        </w:rPr>
-        <w:t>tgl_surat</w:t>
-      </w:r>
-      <w:proofErr w:type="spellEnd"/>
-      <w:r>
-        <w:rPr>
-          <w:rFonts w:ascii="Arial" w:eastAsia="Arial" w:hAnsi="Arial" w:cs="Arial"/>
-          <w:sz w:val="24"/>
-          <w:szCs w:val="24"/>
-        </w:rPr>
-        <w:t>}</w:t>
+        <w:t>{tgl_surat}</w:t>
       </w:r>
     </w:p>
     <w:p>
@@ -2001,25 +1833,7 @@
           <w:sz w:val="24"/>
           <w:szCs w:val="24"/>
         </w:rPr>
-        <w:t xml:space="preserve">ABDUL HALIM, </w:t>
-      </w:r>
-      <w:proofErr w:type="spellStart"/>
-      <w:r>
-        <w:rPr>
-          <w:rFonts w:ascii="Arial" w:eastAsia="Arial" w:hAnsi="Arial" w:cs="Arial"/>
-          <w:sz w:val="24"/>
-          <w:szCs w:val="24"/>
-        </w:rPr>
-        <w:t>S.Pd.I</w:t>
-      </w:r>
-      <w:proofErr w:type="spellEnd"/>
-      <w:r>
-        <w:rPr>
-          <w:rFonts w:ascii="Arial" w:eastAsia="Arial" w:hAnsi="Arial" w:cs="Arial"/>
-          <w:sz w:val="24"/>
-          <w:szCs w:val="24"/>
-        </w:rPr>
-        <w:t xml:space="preserve"> </w:t>
+        <w:t xml:space="preserve">ABDUL HALIM, S.Pd.I </w:t>
       </w:r>
     </w:p>
     <w:p>

</xml_diff>